<commit_message>
fix(templates): the signed sheet's hiring blocks print as the paper's: every value field at the body size, the material field drawn as tall as the material the sheet is drawn up with, and the signer draws a multiline value with Apple's leading, so the material is no longer set in a few points
</commit_message>
<xml_diff>
--- a/packages/document-engine/templates/fire/fisa_instructaj_psi.docx
+++ b/packages/document-engine/templates/fire/fisa_instructaj_psi.docx
@@ -3179,8 +3179,8 @@
                 <w:color w:val="auto"/>
                 <w:spacing w:val="0"/>
                 <w:w w:val="100"/>
-                <w:sz w:val="16"/>
-                <w:szCs w:val="16"/>
+                <w:sz w:val="20"/>
+                <w:szCs w:val="20"/>
                 <w:lang w:val="ro-RO"/>
               </w:rPr>
             </w:pPr>
@@ -3193,8 +3193,8 @@
                   <w:color w:val="auto"/>
                   <w:spacing w:val="0"/>
                   <w:w w:val="100"/>
-                  <w:sz w:val="16"/>
-                  <w:szCs w:val="16"/>
+                  <w:sz w:val="20"/>
+                  <w:szCs w:val="20"/>
                   <w:lang w:val="ro-RO"/>
                 </w:rPr>
                 <w:alias w:val="h1_date"/>
@@ -3212,11 +3212,11 @@
                     <w:color w:val="auto"/>
                     <w:spacing w:val="0"/>
                     <w:w w:val="100"/>
-                    <w:sz w:val="16"/>
-                    <w:szCs w:val="16"/>
-                    <w:lang w:val="ro-RO"/>
-                  </w:rPr>
-                  <w:t xml:space="preserve">                                                                        </w:t>
+                    <w:sz w:val="20"/>
+                    <w:szCs w:val="20"/>
+                    <w:lang w:val="ro-RO"/>
+                  </w:rPr>
+                  <w:t xml:space="preserve">                                                         </w:t>
                 </w:r>
               </w:sdtContent>
             </w:sdt>
@@ -3297,8 +3297,8 @@
                 <w:color w:val="auto"/>
                 <w:spacing w:val="0"/>
                 <w:w w:val="100"/>
-                <w:sz w:val="16"/>
-                <w:szCs w:val="16"/>
+                <w:sz w:val="20"/>
+                <w:szCs w:val="20"/>
                 <w:lang w:val="ro-RO"/>
               </w:rPr>
             </w:pPr>
@@ -3311,8 +3311,8 @@
                   <w:color w:val="auto"/>
                   <w:spacing w:val="0"/>
                   <w:w w:val="100"/>
-                  <w:sz w:val="16"/>
-                  <w:szCs w:val="16"/>
+                  <w:sz w:val="20"/>
+                  <w:szCs w:val="20"/>
                   <w:lang w:val="ro-RO"/>
                 </w:rPr>
                 <w:alias w:val="h1_duration"/>
@@ -3330,11 +3330,11 @@
                     <w:color w:val="auto"/>
                     <w:spacing w:val="0"/>
                     <w:w w:val="100"/>
-                    <w:sz w:val="16"/>
-                    <w:szCs w:val="16"/>
-                    <w:lang w:val="ro-RO"/>
-                  </w:rPr>
-                  <w:t xml:space="preserve">                                                                        </w:t>
+                    <w:sz w:val="20"/>
+                    <w:szCs w:val="20"/>
+                    <w:lang w:val="ro-RO"/>
+                  </w:rPr>
+                  <w:t xml:space="preserve">                                                         </w:t>
                 </w:r>
               </w:sdtContent>
             </w:sdt>
@@ -3415,8 +3415,8 @@
                 <w:color w:val="auto"/>
                 <w:spacing w:val="0"/>
                 <w:w w:val="100"/>
-                <w:sz w:val="16"/>
-                <w:szCs w:val="16"/>
+                <w:sz w:val="20"/>
+                <w:szCs w:val="20"/>
                 <w:lang w:val="ro-RO"/>
               </w:rPr>
             </w:pPr>
@@ -3429,8 +3429,8 @@
                   <w:color w:val="auto"/>
                   <w:spacing w:val="0"/>
                   <w:w w:val="100"/>
-                  <w:sz w:val="16"/>
-                  <w:szCs w:val="16"/>
+                  <w:sz w:val="20"/>
+                  <w:szCs w:val="20"/>
                   <w:lang w:val="ro-RO"/>
                 </w:rPr>
                 <w:alias w:val="h1_trainer"/>
@@ -3448,11 +3448,11 @@
                     <w:color w:val="auto"/>
                     <w:spacing w:val="0"/>
                     <w:w w:val="100"/>
-                    <w:sz w:val="16"/>
-                    <w:szCs w:val="16"/>
-                    <w:lang w:val="ro-RO"/>
-                  </w:rPr>
-                  <w:t xml:space="preserve">                                                                        </w:t>
+                    <w:sz w:val="20"/>
+                    <w:szCs w:val="20"/>
+                    <w:lang w:val="ro-RO"/>
+                  </w:rPr>
+                  <w:t xml:space="preserve">                                                         </w:t>
                 </w:r>
               </w:sdtContent>
             </w:sdt>
@@ -3533,8 +3533,8 @@
                 <w:color w:val="auto"/>
                 <w:spacing w:val="0"/>
                 <w:w w:val="100"/>
-                <w:sz w:val="16"/>
-                <w:szCs w:val="16"/>
+                <w:sz w:val="20"/>
+                <w:szCs w:val="20"/>
                 <w:lang w:val="ro-RO"/>
               </w:rPr>
             </w:pPr>
@@ -3547,8 +3547,8 @@
                   <w:color w:val="auto"/>
                   <w:spacing w:val="0"/>
                   <w:w w:val="100"/>
-                  <w:sz w:val="16"/>
-                  <w:szCs w:val="16"/>
+                  <w:sz w:val="20"/>
+                  <w:szCs w:val="20"/>
                   <w:lang w:val="ro-RO"/>
                 </w:rPr>
                 <w:alias w:val="h1_trainer_job_title"/>
@@ -3566,11 +3566,11 @@
                     <w:color w:val="auto"/>
                     <w:spacing w:val="0"/>
                     <w:w w:val="100"/>
-                    <w:sz w:val="16"/>
-                    <w:szCs w:val="16"/>
-                    <w:lang w:val="ro-RO"/>
-                  </w:rPr>
-                  <w:t xml:space="preserve">                                                                        </w:t>
+                    <w:sz w:val="20"/>
+                    <w:szCs w:val="20"/>
+                    <w:lang w:val="ro-RO"/>
+                  </w:rPr>
+                  <w:t xml:space="preserve">                                                         </w:t>
                 </w:r>
               </w:sdtContent>
             </w:sdt>
@@ -3641,18 +3641,18 @@
               <w:pageBreakBefore w:val="false"/>
               <w:widowControl/>
               <w:bidi w:val="0"/>
-              <w:spacing w:before="0" w:after="0"/>
-              <w:ind w:hanging="0" w:left="0"/>
-              <w:jc w:val="left"/>
-              <w:rPr>
-                <w:rFonts w:eastAsia="Arial" w:cs="Arial" w:ascii="Arial" w:hAnsi="Arial"/>
-                <w:b w:val="false"/>
-                <w:i w:val="false"/>
-                <w:color w:val="auto"/>
-                <w:spacing w:val="0"/>
-                <w:w w:val="100"/>
-                <w:sz w:val="16"/>
-                <w:szCs w:val="16"/>
+              <w:spacing w:before="0" w:after="0" w:line="272" w:lineRule="auto"/>
+              <w:ind w:hanging="0" w:left="0"/>
+              <w:jc w:val="left"/>
+              <w:rPr>
+                <w:rFonts w:eastAsia="Arial" w:cs="Arial" w:ascii="Arial" w:hAnsi="Arial"/>
+                <w:b w:val="false"/>
+                <w:i w:val="false"/>
+                <w:color w:val="auto"/>
+                <w:spacing w:val="0"/>
+                <w:w w:val="100"/>
+                <w:sz w:val="20"/>
+                <w:szCs w:val="20"/>
                 <w:lang w:val="ro-RO"/>
               </w:rPr>
             </w:pPr>
@@ -3665,8 +3665,8 @@
                   <w:color w:val="auto"/>
                   <w:spacing w:val="0"/>
                   <w:w w:val="100"/>
-                  <w:sz w:val="16"/>
-                  <w:szCs w:val="16"/>
+                  <w:sz w:val="20"/>
+                  <w:szCs w:val="20"/>
                   <w:lang w:val="ro-RO"/>
                 </w:rPr>
                 <w:alias w:val="h1_material"/>
@@ -3684,22 +3684,22 @@
                     <w:color w:val="auto"/>
                     <w:spacing w:val="0"/>
                     <w:w w:val="100"/>
-                    <w:sz w:val="16"/>
-                    <w:szCs w:val="16"/>
-                    <w:lang w:val="ro-RO"/>
-                  </w:rPr>
-                  <w:t xml:space="preserve">                                                                        </w:t>
-                </w:r>
-                <w:r>
-                  <w:rPr>
-                    <w:rFonts w:eastAsia="Arial" w:cs="Arial" w:ascii="Arial" w:hAnsi="Arial"/>
-                    <w:b w:val="false"/>
-                    <w:i w:val="false"/>
-                    <w:color w:val="auto"/>
-                    <w:spacing w:val="0"/>
-                    <w:w w:val="100"/>
-                    <w:sz w:val="16"/>
-                    <w:szCs w:val="16"/>
+                    <w:sz w:val="20"/>
+                    <w:szCs w:val="20"/>
+                    <w:lang w:val="ro-RO"/>
+                  </w:rPr>
+                  <w:t xml:space="preserve">{{form.h1.materialPlaceholder}}</w:t>
+                </w:r>
+                <w:r>
+                  <w:rPr>
+                    <w:rFonts w:eastAsia="Arial" w:cs="Arial" w:ascii="Arial" w:hAnsi="Arial"/>
+                    <w:b w:val="false"/>
+                    <w:i w:val="false"/>
+                    <w:color w:val="auto"/>
+                    <w:spacing w:val="0"/>
+                    <w:w w:val="100"/>
+                    <w:sz w:val="14"/>
+                    <w:szCs w:val="14"/>
                     <w:lang w:val="ro-RO"/>
                   </w:rPr>
                   <w:br/>
@@ -3712,39 +3712,11 @@
                     <w:color w:val="auto"/>
                     <w:spacing w:val="0"/>
                     <w:w w:val="100"/>
-                    <w:sz w:val="16"/>
-                    <w:szCs w:val="16"/>
-                    <w:lang w:val="ro-RO"/>
-                  </w:rPr>
-                  <w:t xml:space="preserve">                                                                        </w:t>
-                </w:r>
-                <w:r>
-                  <w:rPr>
-                    <w:rFonts w:eastAsia="Arial" w:cs="Arial" w:ascii="Arial" w:hAnsi="Arial"/>
-                    <w:b w:val="false"/>
-                    <w:i w:val="false"/>
-                    <w:color w:val="auto"/>
-                    <w:spacing w:val="0"/>
-                    <w:w w:val="100"/>
-                    <w:sz w:val="16"/>
-                    <w:szCs w:val="16"/>
-                    <w:lang w:val="ro-RO"/>
-                  </w:rPr>
-                  <w:br/>
-                </w:r>
-                <w:r>
-                  <w:rPr>
-                    <w:rFonts w:eastAsia="Arial" w:cs="Arial" w:ascii="Arial" w:hAnsi="Arial"/>
-                    <w:b w:val="false"/>
-                    <w:i w:val="false"/>
-                    <w:color w:val="auto"/>
-                    <w:spacing w:val="0"/>
-                    <w:w w:val="100"/>
-                    <w:sz w:val="16"/>
-                    <w:szCs w:val="16"/>
-                    <w:lang w:val="ro-RO"/>
-                  </w:rPr>
-                  <w:t xml:space="preserve">                                                                        </w:t>
+                    <w:sz w:val="14"/>
+                    <w:szCs w:val="14"/>
+                    <w:lang w:val="ro-RO"/>
+                  </w:rPr>
+                  <w:t xml:space="preserve">                                                                                  </w:t>
                 </w:r>
               </w:sdtContent>
             </w:sdt>
@@ -3825,8 +3797,8 @@
                 <w:color w:val="auto"/>
                 <w:spacing w:val="0"/>
                 <w:w w:val="100"/>
-                <w:sz w:val="16"/>
-                <w:szCs w:val="16"/>
+                <w:sz w:val="20"/>
+                <w:szCs w:val="20"/>
                 <w:lang w:val="ro-RO"/>
               </w:rPr>
             </w:pPr>
@@ -3839,8 +3811,8 @@
                   <w:color w:val="auto"/>
                   <w:spacing w:val="0"/>
                   <w:w w:val="100"/>
-                  <w:sz w:val="16"/>
-                  <w:szCs w:val="16"/>
+                  <w:sz w:val="20"/>
+                  <w:szCs w:val="20"/>
                   <w:lang w:val="ro-RO"/>
                 </w:rPr>
                 <w:alias w:val="h1_note"/>
@@ -3858,11 +3830,11 @@
                     <w:color w:val="auto"/>
                     <w:spacing w:val="0"/>
                     <w:w w:val="100"/>
-                    <w:sz w:val="16"/>
-                    <w:szCs w:val="16"/>
-                    <w:lang w:val="ro-RO"/>
-                  </w:rPr>
-                  <w:t xml:space="preserve">                                                                        </w:t>
+                    <w:sz w:val="20"/>
+                    <w:szCs w:val="20"/>
+                    <w:lang w:val="ro-RO"/>
+                  </w:rPr>
+                  <w:t xml:space="preserve">                                                         </w:t>
                 </w:r>
               </w:sdtContent>
             </w:sdt>
@@ -6742,8 +6714,8 @@
                 <w:color w:val="auto"/>
                 <w:spacing w:val="0"/>
                 <w:w w:val="100"/>
-                <w:sz w:val="16"/>
-                <w:szCs w:val="16"/>
+                <w:sz w:val="20"/>
+                <w:szCs w:val="20"/>
                 <w:lang w:val="ro-RO"/>
               </w:rPr>
             </w:pPr>
@@ -6756,8 +6728,8 @@
                   <w:color w:val="auto"/>
                   <w:spacing w:val="0"/>
                   <w:w w:val="100"/>
-                  <w:sz w:val="16"/>
-                  <w:szCs w:val="16"/>
+                  <w:sz w:val="20"/>
+                  <w:szCs w:val="20"/>
                   <w:lang w:val="ro-RO"/>
                 </w:rPr>
                 <w:alias w:val="h2_date"/>
@@ -6775,11 +6747,11 @@
                     <w:color w:val="auto"/>
                     <w:spacing w:val="0"/>
                     <w:w w:val="100"/>
-                    <w:sz w:val="16"/>
-                    <w:szCs w:val="16"/>
-                    <w:lang w:val="ro-RO"/>
-                  </w:rPr>
-                  <w:t xml:space="preserve">                                                                        </w:t>
+                    <w:sz w:val="20"/>
+                    <w:szCs w:val="20"/>
+                    <w:lang w:val="ro-RO"/>
+                  </w:rPr>
+                  <w:t xml:space="preserve">                                                         </w:t>
                 </w:r>
               </w:sdtContent>
             </w:sdt>
@@ -6860,8 +6832,8 @@
                 <w:color w:val="auto"/>
                 <w:spacing w:val="0"/>
                 <w:w w:val="100"/>
-                <w:sz w:val="16"/>
-                <w:szCs w:val="16"/>
+                <w:sz w:val="20"/>
+                <w:szCs w:val="20"/>
                 <w:lang w:val="ro-RO"/>
               </w:rPr>
             </w:pPr>
@@ -6874,8 +6846,8 @@
                   <w:color w:val="auto"/>
                   <w:spacing w:val="0"/>
                   <w:w w:val="100"/>
-                  <w:sz w:val="16"/>
-                  <w:szCs w:val="16"/>
+                  <w:sz w:val="20"/>
+                  <w:szCs w:val="20"/>
                   <w:lang w:val="ro-RO"/>
                 </w:rPr>
                 <w:alias w:val="h2_place"/>
@@ -6893,11 +6865,11 @@
                     <w:color w:val="auto"/>
                     <w:spacing w:val="0"/>
                     <w:w w:val="100"/>
-                    <w:sz w:val="16"/>
-                    <w:szCs w:val="16"/>
-                    <w:lang w:val="ro-RO"/>
-                  </w:rPr>
-                  <w:t xml:space="preserve">                                                                        </w:t>
+                    <w:sz w:val="20"/>
+                    <w:szCs w:val="20"/>
+                    <w:lang w:val="ro-RO"/>
+                  </w:rPr>
+                  <w:t xml:space="preserve">                                                         </w:t>
                 </w:r>
               </w:sdtContent>
             </w:sdt>
@@ -6978,8 +6950,8 @@
                 <w:color w:val="auto"/>
                 <w:spacing w:val="0"/>
                 <w:w w:val="100"/>
-                <w:sz w:val="16"/>
-                <w:szCs w:val="16"/>
+                <w:sz w:val="20"/>
+                <w:szCs w:val="20"/>
                 <w:lang w:val="ro-RO"/>
               </w:rPr>
             </w:pPr>
@@ -6992,8 +6964,8 @@
                   <w:color w:val="auto"/>
                   <w:spacing w:val="0"/>
                   <w:w w:val="100"/>
-                  <w:sz w:val="16"/>
-                  <w:szCs w:val="16"/>
+                  <w:sz w:val="20"/>
+                  <w:szCs w:val="20"/>
                   <w:lang w:val="ro-RO"/>
                 </w:rPr>
                 <w:alias w:val="h2_occupation"/>
@@ -7011,11 +6983,11 @@
                     <w:color w:val="auto"/>
                     <w:spacing w:val="0"/>
                     <w:w w:val="100"/>
-                    <w:sz w:val="16"/>
-                    <w:szCs w:val="16"/>
-                    <w:lang w:val="ro-RO"/>
-                  </w:rPr>
-                  <w:t xml:space="preserve">                                                                        </w:t>
+                    <w:sz w:val="20"/>
+                    <w:szCs w:val="20"/>
+                    <w:lang w:val="ro-RO"/>
+                  </w:rPr>
+                  <w:t xml:space="preserve">                                                         </w:t>
                 </w:r>
               </w:sdtContent>
             </w:sdt>
@@ -7096,8 +7068,8 @@
                 <w:color w:val="auto"/>
                 <w:spacing w:val="0"/>
                 <w:w w:val="100"/>
-                <w:sz w:val="16"/>
-                <w:szCs w:val="16"/>
+                <w:sz w:val="20"/>
+                <w:szCs w:val="20"/>
                 <w:lang w:val="ro-RO"/>
               </w:rPr>
             </w:pPr>
@@ -7110,8 +7082,8 @@
                   <w:color w:val="auto"/>
                   <w:spacing w:val="0"/>
                   <w:w w:val="100"/>
-                  <w:sz w:val="16"/>
-                  <w:szCs w:val="16"/>
+                  <w:sz w:val="20"/>
+                  <w:szCs w:val="20"/>
                   <w:lang w:val="ro-RO"/>
                 </w:rPr>
                 <w:alias w:val="h2_duration"/>
@@ -7129,11 +7101,11 @@
                     <w:color w:val="auto"/>
                     <w:spacing w:val="0"/>
                     <w:w w:val="100"/>
-                    <w:sz w:val="16"/>
-                    <w:szCs w:val="16"/>
-                    <w:lang w:val="ro-RO"/>
-                  </w:rPr>
-                  <w:t xml:space="preserve">                                                                        </w:t>
+                    <w:sz w:val="20"/>
+                    <w:szCs w:val="20"/>
+                    <w:lang w:val="ro-RO"/>
+                  </w:rPr>
+                  <w:t xml:space="preserve">                                                         </w:t>
                 </w:r>
               </w:sdtContent>
             </w:sdt>
@@ -7214,8 +7186,8 @@
                 <w:color w:val="auto"/>
                 <w:spacing w:val="0"/>
                 <w:w w:val="100"/>
-                <w:sz w:val="16"/>
-                <w:szCs w:val="16"/>
+                <w:sz w:val="20"/>
+                <w:szCs w:val="20"/>
                 <w:lang w:val="ro-RO"/>
               </w:rPr>
             </w:pPr>
@@ -7228,8 +7200,8 @@
                   <w:color w:val="auto"/>
                   <w:spacing w:val="0"/>
                   <w:w w:val="100"/>
-                  <w:sz w:val="16"/>
-                  <w:szCs w:val="16"/>
+                  <w:sz w:val="20"/>
+                  <w:szCs w:val="20"/>
                   <w:lang w:val="ro-RO"/>
                 </w:rPr>
                 <w:alias w:val="h2_trainer"/>
@@ -7247,11 +7219,11 @@
                     <w:color w:val="auto"/>
                     <w:spacing w:val="0"/>
                     <w:w w:val="100"/>
-                    <w:sz w:val="16"/>
-                    <w:szCs w:val="16"/>
-                    <w:lang w:val="ro-RO"/>
-                  </w:rPr>
-                  <w:t xml:space="preserve">                                                                        </w:t>
+                    <w:sz w:val="20"/>
+                    <w:szCs w:val="20"/>
+                    <w:lang w:val="ro-RO"/>
+                  </w:rPr>
+                  <w:t xml:space="preserve">                                                         </w:t>
                 </w:r>
               </w:sdtContent>
             </w:sdt>
@@ -7332,8 +7304,8 @@
                 <w:color w:val="auto"/>
                 <w:spacing w:val="0"/>
                 <w:w w:val="100"/>
-                <w:sz w:val="16"/>
-                <w:szCs w:val="16"/>
+                <w:sz w:val="20"/>
+                <w:szCs w:val="20"/>
                 <w:lang w:val="ro-RO"/>
               </w:rPr>
             </w:pPr>
@@ -7346,8 +7318,8 @@
                   <w:color w:val="auto"/>
                   <w:spacing w:val="0"/>
                   <w:w w:val="100"/>
-                  <w:sz w:val="16"/>
-                  <w:szCs w:val="16"/>
+                  <w:sz w:val="20"/>
+                  <w:szCs w:val="20"/>
                   <w:lang w:val="ro-RO"/>
                 </w:rPr>
                 <w:alias w:val="h2_trainer_job_title"/>
@@ -7365,11 +7337,11 @@
                     <w:color w:val="auto"/>
                     <w:spacing w:val="0"/>
                     <w:w w:val="100"/>
-                    <w:sz w:val="16"/>
-                    <w:szCs w:val="16"/>
-                    <w:lang w:val="ro-RO"/>
-                  </w:rPr>
-                  <w:t xml:space="preserve">                                                                        </w:t>
+                    <w:sz w:val="20"/>
+                    <w:szCs w:val="20"/>
+                    <w:lang w:val="ro-RO"/>
+                  </w:rPr>
+                  <w:t xml:space="preserve">                                                         </w:t>
                 </w:r>
               </w:sdtContent>
             </w:sdt>
@@ -7440,18 +7412,18 @@
               <w:pageBreakBefore w:val="false"/>
               <w:widowControl/>
               <w:bidi w:val="0"/>
-              <w:spacing w:before="0" w:after="0"/>
-              <w:ind w:hanging="0" w:left="0"/>
-              <w:jc w:val="left"/>
-              <w:rPr>
-                <w:rFonts w:eastAsia="Arial" w:cs="Arial" w:ascii="Arial" w:hAnsi="Arial"/>
-                <w:b w:val="false"/>
-                <w:i w:val="false"/>
-                <w:color w:val="auto"/>
-                <w:spacing w:val="0"/>
-                <w:w w:val="100"/>
-                <w:sz w:val="16"/>
-                <w:szCs w:val="16"/>
+              <w:spacing w:before="0" w:after="0" w:line="272" w:lineRule="auto"/>
+              <w:ind w:hanging="0" w:left="0"/>
+              <w:jc w:val="left"/>
+              <w:rPr>
+                <w:rFonts w:eastAsia="Arial" w:cs="Arial" w:ascii="Arial" w:hAnsi="Arial"/>
+                <w:b w:val="false"/>
+                <w:i w:val="false"/>
+                <w:color w:val="auto"/>
+                <w:spacing w:val="0"/>
+                <w:w w:val="100"/>
+                <w:sz w:val="20"/>
+                <w:szCs w:val="20"/>
                 <w:lang w:val="ro-RO"/>
               </w:rPr>
             </w:pPr>
@@ -7464,8 +7436,8 @@
                   <w:color w:val="auto"/>
                   <w:spacing w:val="0"/>
                   <w:w w:val="100"/>
-                  <w:sz w:val="16"/>
-                  <w:szCs w:val="16"/>
+                  <w:sz w:val="20"/>
+                  <w:szCs w:val="20"/>
                   <w:lang w:val="ro-RO"/>
                 </w:rPr>
                 <w:alias w:val="h2_material"/>
@@ -7483,22 +7455,22 @@
                     <w:color w:val="auto"/>
                     <w:spacing w:val="0"/>
                     <w:w w:val="100"/>
-                    <w:sz w:val="16"/>
-                    <w:szCs w:val="16"/>
-                    <w:lang w:val="ro-RO"/>
-                  </w:rPr>
-                  <w:t xml:space="preserve">                                                                        </w:t>
-                </w:r>
-                <w:r>
-                  <w:rPr>
-                    <w:rFonts w:eastAsia="Arial" w:cs="Arial" w:ascii="Arial" w:hAnsi="Arial"/>
-                    <w:b w:val="false"/>
-                    <w:i w:val="false"/>
-                    <w:color w:val="auto"/>
-                    <w:spacing w:val="0"/>
-                    <w:w w:val="100"/>
-                    <w:sz w:val="16"/>
-                    <w:szCs w:val="16"/>
+                    <w:sz w:val="20"/>
+                    <w:szCs w:val="20"/>
+                    <w:lang w:val="ro-RO"/>
+                  </w:rPr>
+                  <w:t xml:space="preserve">{{form.h2.materialPlaceholder}}</w:t>
+                </w:r>
+                <w:r>
+                  <w:rPr>
+                    <w:rFonts w:eastAsia="Arial" w:cs="Arial" w:ascii="Arial" w:hAnsi="Arial"/>
+                    <w:b w:val="false"/>
+                    <w:i w:val="false"/>
+                    <w:color w:val="auto"/>
+                    <w:spacing w:val="0"/>
+                    <w:w w:val="100"/>
+                    <w:sz w:val="14"/>
+                    <w:szCs w:val="14"/>
                     <w:lang w:val="ro-RO"/>
                   </w:rPr>
                   <w:br/>
@@ -7511,39 +7483,11 @@
                     <w:color w:val="auto"/>
                     <w:spacing w:val="0"/>
                     <w:w w:val="100"/>
-                    <w:sz w:val="16"/>
-                    <w:szCs w:val="16"/>
-                    <w:lang w:val="ro-RO"/>
-                  </w:rPr>
-                  <w:t xml:space="preserve">                                                                        </w:t>
-                </w:r>
-                <w:r>
-                  <w:rPr>
-                    <w:rFonts w:eastAsia="Arial" w:cs="Arial" w:ascii="Arial" w:hAnsi="Arial"/>
-                    <w:b w:val="false"/>
-                    <w:i w:val="false"/>
-                    <w:color w:val="auto"/>
-                    <w:spacing w:val="0"/>
-                    <w:w w:val="100"/>
-                    <w:sz w:val="16"/>
-                    <w:szCs w:val="16"/>
-                    <w:lang w:val="ro-RO"/>
-                  </w:rPr>
-                  <w:br/>
-                </w:r>
-                <w:r>
-                  <w:rPr>
-                    <w:rFonts w:eastAsia="Arial" w:cs="Arial" w:ascii="Arial" w:hAnsi="Arial"/>
-                    <w:b w:val="false"/>
-                    <w:i w:val="false"/>
-                    <w:color w:val="auto"/>
-                    <w:spacing w:val="0"/>
-                    <w:w w:val="100"/>
-                    <w:sz w:val="16"/>
-                    <w:szCs w:val="16"/>
-                    <w:lang w:val="ro-RO"/>
-                  </w:rPr>
-                  <w:t xml:space="preserve">                                                                        </w:t>
+                    <w:sz w:val="14"/>
+                    <w:szCs w:val="14"/>
+                    <w:lang w:val="ro-RO"/>
+                  </w:rPr>
+                  <w:t xml:space="preserve">                                                                                  </w:t>
                 </w:r>
               </w:sdtContent>
             </w:sdt>
@@ -7624,8 +7568,8 @@
                 <w:color w:val="auto"/>
                 <w:spacing w:val="0"/>
                 <w:w w:val="100"/>
-                <w:sz w:val="16"/>
-                <w:szCs w:val="16"/>
+                <w:sz w:val="20"/>
+                <w:szCs w:val="20"/>
                 <w:lang w:val="ro-RO"/>
               </w:rPr>
             </w:pPr>
@@ -7638,8 +7582,8 @@
                   <w:color w:val="auto"/>
                   <w:spacing w:val="0"/>
                   <w:w w:val="100"/>
-                  <w:sz w:val="16"/>
-                  <w:szCs w:val="16"/>
+                  <w:sz w:val="20"/>
+                  <w:szCs w:val="20"/>
                   <w:lang w:val="ro-RO"/>
                 </w:rPr>
                 <w:alias w:val="h2_note"/>
@@ -7657,11 +7601,11 @@
                     <w:color w:val="auto"/>
                     <w:spacing w:val="0"/>
                     <w:w w:val="100"/>
-                    <w:sz w:val="16"/>
-                    <w:szCs w:val="16"/>
-                    <w:lang w:val="ro-RO"/>
-                  </w:rPr>
-                  <w:t xml:space="preserve">                                                                        </w:t>
+                    <w:sz w:val="20"/>
+                    <w:szCs w:val="20"/>
+                    <w:lang w:val="ro-RO"/>
+                  </w:rPr>
+                  <w:t xml:space="preserve">                                                         </w:t>
                 </w:r>
               </w:sdtContent>
             </w:sdt>
@@ -9187,8 +9131,8 @@
                 <w:color w:val="auto"/>
                 <w:spacing w:val="0"/>
                 <w:w w:val="100"/>
-                <w:sz w:val="16"/>
-                <w:szCs w:val="16"/>
+                <w:sz w:val="20"/>
+                <w:szCs w:val="20"/>
                 <w:lang w:val="ro-RO"/>
               </w:rPr>
             </w:pPr>
@@ -9201,8 +9145,8 @@
                   <w:color w:val="auto"/>
                   <w:spacing w:val="0"/>
                   <w:w w:val="100"/>
-                  <w:sz w:val="16"/>
-                  <w:szCs w:val="16"/>
+                  <w:sz w:val="20"/>
+                  <w:szCs w:val="20"/>
                   <w:lang w:val="ro-RO"/>
                 </w:rPr>
                 <w:alias w:val="adm_date"/>
@@ -9220,11 +9164,11 @@
                     <w:color w:val="auto"/>
                     <w:spacing w:val="0"/>
                     <w:w w:val="100"/>
-                    <w:sz w:val="16"/>
-                    <w:szCs w:val="16"/>
-                    <w:lang w:val="ro-RO"/>
-                  </w:rPr>
-                  <w:t xml:space="preserve">                                                                        </w:t>
+                    <w:sz w:val="20"/>
+                    <w:szCs w:val="20"/>
+                    <w:lang w:val="ro-RO"/>
+                  </w:rPr>
+                  <w:t xml:space="preserve">                                                         </w:t>
                 </w:r>
               </w:sdtContent>
             </w:sdt>
@@ -9305,8 +9249,8 @@
                 <w:color w:val="auto"/>
                 <w:spacing w:val="0"/>
                 <w:w w:val="100"/>
-                <w:sz w:val="16"/>
-                <w:szCs w:val="16"/>
+                <w:sz w:val="20"/>
+                <w:szCs w:val="20"/>
                 <w:lang w:val="ro-RO"/>
               </w:rPr>
             </w:pPr>
@@ -9319,8 +9263,8 @@
                   <w:color w:val="auto"/>
                   <w:spacing w:val="0"/>
                   <w:w w:val="100"/>
-                  <w:sz w:val="16"/>
-                  <w:szCs w:val="16"/>
+                  <w:sz w:val="20"/>
+                  <w:szCs w:val="20"/>
                   <w:lang w:val="ro-RO"/>
                 </w:rPr>
                 <w:alias w:val="adm_name"/>
@@ -9338,11 +9282,11 @@
                     <w:color w:val="auto"/>
                     <w:spacing w:val="0"/>
                     <w:w w:val="100"/>
-                    <w:sz w:val="16"/>
-                    <w:szCs w:val="16"/>
-                    <w:lang w:val="ro-RO"/>
-                  </w:rPr>
-                  <w:t xml:space="preserve">                                                                        </w:t>
+                    <w:sz w:val="20"/>
+                    <w:szCs w:val="20"/>
+                    <w:lang w:val="ro-RO"/>
+                  </w:rPr>
+                  <w:t xml:space="preserve">                                                         </w:t>
                 </w:r>
               </w:sdtContent>
             </w:sdt>
@@ -9423,8 +9367,8 @@
                 <w:color w:val="auto"/>
                 <w:spacing w:val="0"/>
                 <w:w w:val="100"/>
-                <w:sz w:val="16"/>
-                <w:szCs w:val="16"/>
+                <w:sz w:val="20"/>
+                <w:szCs w:val="20"/>
                 <w:lang w:val="ro-RO"/>
               </w:rPr>
             </w:pPr>
@@ -9437,8 +9381,8 @@
                   <w:color w:val="auto"/>
                   <w:spacing w:val="0"/>
                   <w:w w:val="100"/>
-                  <w:sz w:val="16"/>
-                  <w:szCs w:val="16"/>
+                  <w:sz w:val="20"/>
+                  <w:szCs w:val="20"/>
                   <w:lang w:val="ro-RO"/>
                 </w:rPr>
                 <w:alias w:val="adm_job_title"/>
@@ -9456,11 +9400,11 @@
                     <w:color w:val="auto"/>
                     <w:spacing w:val="0"/>
                     <w:w w:val="100"/>
-                    <w:sz w:val="16"/>
-                    <w:szCs w:val="16"/>
-                    <w:lang w:val="ro-RO"/>
-                  </w:rPr>
-                  <w:t xml:space="preserve">                                                                        </w:t>
+                    <w:sz w:val="20"/>
+                    <w:szCs w:val="20"/>
+                    <w:lang w:val="ro-RO"/>
+                  </w:rPr>
+                  <w:t xml:space="preserve">                                                         </w:t>
                 </w:r>
               </w:sdtContent>
             </w:sdt>

</xml_diff>